<commit_message>
voy a ver bien
</commit_message>
<xml_diff>
--- a/Curso_C#/Mapas Endpoints/Plan Modulo de Gestion de Rutinas.docx
+++ b/Curso_C#/Mapas Endpoints/Plan Modulo de Gestion de Rutinas.docx
@@ -5,10 +5,14 @@
     <w:p>
       <w:pPr>
         <w:jc w:val="center"/>
+        <w:rPr>
+          <w:sz w:val="24"/>
+        </w:rPr>
       </w:pPr>
       <w:r>
         <w:rPr>
           <w:noProof/>
+          <w:sz w:val="24"/>
           <w:lang w:eastAsia="es-AR"/>
         </w:rPr>
         <mc:AlternateContent>
@@ -259,6 +263,7 @@
       <w:r>
         <w:rPr>
           <w:noProof/>
+          <w:sz w:val="24"/>
           <w:lang w:eastAsia="es-AR"/>
         </w:rPr>
         <w:drawing>
@@ -318,6 +323,11 @@
         </w:drawing>
       </w:r>
       <w:r>
+        <w:rPr>
+          <w:noProof/>
+          <w:sz w:val="24"/>
+          <w:lang w:eastAsia="es-AR"/>
+        </w:rPr>
         <w:drawing>
           <wp:anchor distT="0" distB="0" distL="114300" distR="114300" simplePos="0" relativeHeight="251674624" behindDoc="1" locked="0" layoutInCell="1" allowOverlap="1" wp14:anchorId="04E84455" wp14:editId="522C91B1">
             <wp:simplePos x="0" y="0"/>
@@ -385,6 +395,7 @@
       <w:r>
         <w:rPr>
           <w:noProof/>
+          <w:sz w:val="24"/>
           <w:lang w:eastAsia="es-AR"/>
         </w:rPr>
         <mc:AlternateContent>
@@ -631,6 +642,7 @@
       <w:r>
         <w:rPr>
           <w:noProof/>
+          <w:sz w:val="24"/>
           <w:lang w:eastAsia="es-AR"/>
         </w:rPr>
         <mc:AlternateContent>
@@ -877,6 +889,7 @@
       <w:r>
         <w:rPr>
           <w:noProof/>
+          <w:sz w:val="24"/>
           <w:lang w:eastAsia="es-AR"/>
         </w:rPr>
         <mc:AlternateContent>
@@ -1123,6 +1136,7 @@
       <w:r>
         <w:rPr>
           <w:noProof/>
+          <w:sz w:val="24"/>
           <w:lang w:eastAsia="es-AR"/>
         </w:rPr>
         <mc:AlternateContent>
@@ -1372,19 +1386,14 @@
           <w:b/>
           <w:bCs/>
           <w:color w:val="000000"/>
+          <w:sz w:val="24"/>
         </w:rPr>
         <w:t>Módulo de Gestión de Rutinas</w:t>
       </w:r>
       <w:r>
         <w:rPr>
           <w:noProof/>
-          <w:lang w:eastAsia="es-AR"/>
-        </w:rPr>
-        <w:t xml:space="preserve"> </w:t>
-      </w:r>
-      <w:r>
-        <w:rPr>
-          <w:noProof/>
+          <w:sz w:val="24"/>
           <w:lang w:eastAsia="es-AR"/>
         </w:rPr>
         <mc:AlternateContent>
@@ -1630,6 +1639,7 @@
       <w:r>
         <w:rPr>
           <w:noProof/>
+          <w:sz w:val="24"/>
           <w:lang w:eastAsia="es-AR"/>
         </w:rPr>
         <mc:AlternateContent>
@@ -1875,6 +1885,7 @@
       <w:r>
         <w:rPr>
           <w:noProof/>
+          <w:sz w:val="24"/>
           <w:lang w:eastAsia="es-AR"/>
         </w:rPr>
         <mc:AlternateContent>
@@ -2120,6 +2131,7 @@
       <w:r>
         <w:rPr>
           <w:noProof/>
+          <w:sz w:val="24"/>
           <w:lang w:eastAsia="es-AR"/>
         </w:rPr>
         <mc:AlternateContent>
@@ -2195,7 +2207,6 @@
                                 </w14:textOutline>
                               </w:rPr>
                             </w:pPr>
-                            <w:bookmarkStart w:id="0" w:name="_GoBack"/>
                             <w:r>
                               <w:rPr>
                                 <w:color w:val="FF0000"/>
@@ -2215,7 +2226,6 @@
                               </w:rPr>
                               <w:t>(1)</w:t>
                             </w:r>
-                            <w:bookmarkEnd w:id="0"/>
                           </w:p>
                         </w:txbxContent>
                       </wps:txbx>
@@ -2261,7 +2271,6 @@
                           </w14:textOutline>
                         </w:rPr>
                       </w:pPr>
-                      <w:bookmarkStart w:id="1" w:name="_GoBack"/>
                       <w:r>
                         <w:rPr>
                           <w:color w:val="FF0000"/>
@@ -2281,7 +2290,6 @@
                         </w:rPr>
                         <w:t>(1)</w:t>
                       </w:r>
-                      <w:bookmarkEnd w:id="1"/>
                     </w:p>
                   </w:txbxContent>
                 </v:textbox>
@@ -2292,23 +2300,21 @@
       </w:r>
     </w:p>
     <w:p>
-      <w:proofErr w:type="spellStart"/>
-      <w:r>
-        <w:t>Endpoints</w:t>
-      </w:r>
-      <w:proofErr w:type="spellEnd"/>
-      <w:r>
-        <w:t xml:space="preserve"> previos necesarios para armar el </w:t>
-      </w:r>
-      <w:proofErr w:type="spellStart"/>
-      <w:r>
-        <w:t>front</w:t>
-      </w:r>
-      <w:proofErr w:type="spellEnd"/>
-      <w:r>
-        <w:t xml:space="preserve"> de Rutinas</w:t>
-      </w:r>
-      <w:r>
+      <w:pPr>
+        <w:rPr>
+          <w:b/>
+        </w:rPr>
+      </w:pPr>
+      <w:r>
+        <w:rPr>
+          <w:b/>
+        </w:rPr>
+        <w:t>Endpoints previos necesarios para armar el front de Rutinas</w:t>
+      </w:r>
+      <w:r>
+        <w:rPr>
+          <w:b/>
+        </w:rPr>
         <w:t>:</w:t>
       </w:r>
     </w:p>
@@ -2324,15 +2330,7 @@
         <w:spacing w:before="150" w:after="150" w:line="240" w:lineRule="auto"/>
       </w:pPr>
       <w:r>
-        <w:t>GET api/</w:t>
-      </w:r>
-      <w:proofErr w:type="spellStart"/>
-      <w:r>
-        <w:t>Auth</w:t>
-      </w:r>
-      <w:proofErr w:type="spellEnd"/>
-      <w:r>
-        <w:t>/permisos-actuales</w:t>
+        <w:t>GET api/Permiso</w:t>
       </w:r>
       <w:r>
         <w:t xml:space="preserve"> </w:t>
@@ -2356,7 +2354,13 @@
         <w:t>.</w:t>
       </w:r>
       <w:r>
-        <w:t xml:space="preserve"> Botones:</w:t>
+        <w:t xml:space="preserve"> Botones</w:t>
+      </w:r>
+      <w:r>
+        <w:t xml:space="preserve"> con su Permiso asignado</w:t>
+      </w:r>
+      <w:r>
+        <w:t>:</w:t>
       </w:r>
     </w:p>
     <w:p>
@@ -2468,7 +2472,29 @@
         <w:t>RECUPERAR_RUTINA</w:t>
       </w:r>
     </w:p>
-    <w:p/>
+    <w:p>
+      <w:pPr>
+        <w:numPr>
+          <w:ilvl w:val="0"/>
+          <w:numId w:val="3"/>
+        </w:numPr>
+        <w:autoSpaceDE w:val="0"/>
+        <w:autoSpaceDN w:val="0"/>
+        <w:adjustRightInd w:val="0"/>
+        <w:spacing w:before="150" w:after="150" w:line="240" w:lineRule="auto"/>
+        <w:rPr>
+          <w:color w:val="FF0000"/>
+        </w:rPr>
+      </w:pPr>
+      <w:r>
+        <w:rPr>
+          <w:color w:val="FF0000"/>
+        </w:rPr>
+        <w:t>HACER LO MISMO CON LOS BOTONES DE GRUPO</w:t>
+      </w:r>
+      <w:bookmarkStart w:id="0" w:name="_GoBack"/>
+      <w:bookmarkEnd w:id="0"/>
+    </w:p>
     <w:p>
       <w:r>
         <w:t>Flujo</w:t>
@@ -2501,14 +2527,12 @@
         </w:rPr>
         <w:t>GET api/</w:t>
       </w:r>
-      <w:proofErr w:type="spellStart"/>
       <w:r>
         <w:rPr>
           <w:color w:val="000000" w:themeColor="text1"/>
         </w:rPr>
         <w:t>RangoHorario</w:t>
       </w:r>
-      <w:proofErr w:type="spellEnd"/>
       <w:r>
         <w:rPr>
           <w:color w:val="000000" w:themeColor="text1"/>
@@ -2521,21 +2545,8 @@
       <w:r>
         <w:t xml:space="preserve"> Obtengo </w:t>
       </w:r>
-      <w:proofErr w:type="spellStart"/>
-      <w:r>
-        <w:t>IEnumerable</w:t>
-      </w:r>
-      <w:proofErr w:type="spellEnd"/>
-      <w:r>
-        <w:t>&lt;</w:t>
-      </w:r>
-      <w:proofErr w:type="spellStart"/>
-      <w:r>
-        <w:t>RangoHorarioDto</w:t>
-      </w:r>
-      <w:proofErr w:type="spellEnd"/>
-      <w:r>
-        <w:t>&gt;</w:t>
+      <w:r>
+        <w:t>IEnumerable&lt;RangoHorarioDto&gt;</w:t>
       </w:r>
       <w:r>
         <w:t xml:space="preserve"> </w:t>
@@ -2546,30 +2557,12 @@
       <w:r>
         <w:t xml:space="preserve"> Front: </w:t>
       </w:r>
-      <w:proofErr w:type="spellStart"/>
-      <w:r>
-        <w:t>Dropdown</w:t>
-      </w:r>
-      <w:proofErr w:type="spellEnd"/>
-      <w:r>
-        <w:t xml:space="preserve"> (</w:t>
-      </w:r>
-      <w:proofErr w:type="spellStart"/>
-      <w:r>
-        <w:t>ComboBox</w:t>
-      </w:r>
-      <w:proofErr w:type="spellEnd"/>
-      <w:r>
-        <w:t>)</w:t>
-      </w:r>
-      <w:r>
-        <w:t xml:space="preserve"> de </w:t>
-      </w:r>
-      <w:proofErr w:type="spellStart"/>
-      <w:r>
-        <w:t>horaDesde-horaHasta</w:t>
-      </w:r>
-      <w:proofErr w:type="spellEnd"/>
+      <w:r>
+        <w:t>Dropdown (ComboBox)</w:t>
+      </w:r>
+      <w:r>
+        <w:t xml:space="preserve"> de horaDesde-horaHasta</w:t>
+      </w:r>
       <w:r>
         <w:t xml:space="preserve"> </w:t>
       </w:r>
@@ -2579,11 +2572,9 @@
       <w:r>
         <w:t xml:space="preserve"> Obtengo un </w:t>
       </w:r>
-      <w:proofErr w:type="spellStart"/>
       <w:r>
         <w:t>idRangoHorario</w:t>
       </w:r>
-      <w:proofErr w:type="spellEnd"/>
       <w:r>
         <w:t>.</w:t>
       </w:r>
@@ -2609,15 +2600,7 @@
         <w:t>Rutina</w:t>
       </w:r>
       <w:r>
-        <w:t>/entrenadores/{</w:t>
-      </w:r>
-      <w:proofErr w:type="spellStart"/>
-      <w:r>
-        <w:t>idRangoHorario</w:t>
-      </w:r>
-      <w:proofErr w:type="spellEnd"/>
-      <w:r>
-        <w:t>}</w:t>
+        <w:t>/entrenadores/{idRangoHorario}</w:t>
       </w:r>
       <w:r>
         <w:t xml:space="preserve"> </w:t>
@@ -2628,21 +2611,8 @@
       <w:r>
         <w:t xml:space="preserve"> Obtengo </w:t>
       </w:r>
-      <w:proofErr w:type="spellStart"/>
-      <w:r>
-        <w:t>List</w:t>
-      </w:r>
-      <w:proofErr w:type="spellEnd"/>
-      <w:r>
-        <w:t>&lt;</w:t>
-      </w:r>
-      <w:proofErr w:type="spellStart"/>
-      <w:r>
-        <w:t>EntrenadorDto</w:t>
-      </w:r>
-      <w:proofErr w:type="spellEnd"/>
-      <w:r>
-        <w:t>&gt;</w:t>
+      <w:r>
+        <w:t>List&lt;EntrenadorDto&gt;</w:t>
       </w:r>
       <w:r>
         <w:t xml:space="preserve"> </w:t>
@@ -2656,24 +2626,14 @@
       <w:r>
         <w:t xml:space="preserve">Front: </w:t>
       </w:r>
-      <w:proofErr w:type="spellStart"/>
-      <w:r>
-        <w:t>DataGrid</w:t>
-      </w:r>
-      <w:proofErr w:type="spellEnd"/>
-      <w:r>
-        <w:t xml:space="preserve"> </w:t>
+      <w:r>
+        <w:t xml:space="preserve">DataGrid </w:t>
       </w:r>
       <w:r>
         <w:t xml:space="preserve">con </w:t>
       </w:r>
-      <w:proofErr w:type="spellStart"/>
-      <w:r>
-        <w:t>checkbox</w:t>
-      </w:r>
-      <w:proofErr w:type="spellEnd"/>
-      <w:r>
-        <w:t xml:space="preserve"> </w:t>
+      <w:r>
+        <w:t xml:space="preserve">checkbox </w:t>
       </w:r>
       <w:r>
         <w:t xml:space="preserve">para cada Nombre y Apellido </w:t>
@@ -2687,11 +2647,9 @@
       <w:r>
         <w:t xml:space="preserve">un </w:t>
       </w:r>
-      <w:proofErr w:type="spellStart"/>
       <w:r>
         <w:t>IdUsuario</w:t>
       </w:r>
-      <w:proofErr w:type="spellEnd"/>
       <w:r>
         <w:t xml:space="preserve"> (Entrenador)</w:t>
       </w:r>
@@ -2728,21 +2686,8 @@
       <w:r>
         <w:t xml:space="preserve"> Obtengo </w:t>
       </w:r>
-      <w:proofErr w:type="spellStart"/>
-      <w:r>
-        <w:t>IEnumerable</w:t>
-      </w:r>
-      <w:proofErr w:type="spellEnd"/>
-      <w:r>
-        <w:t>&lt;</w:t>
-      </w:r>
-      <w:proofErr w:type="spellStart"/>
-      <w:r>
-        <w:t>SocioTurnoDto</w:t>
-      </w:r>
-      <w:proofErr w:type="spellEnd"/>
-      <w:r>
-        <w:t>&gt;</w:t>
+      <w:r>
+        <w:t>IEnumerable&lt;SocioTurnoDto&gt;</w:t>
       </w:r>
       <w:r>
         <w:t xml:space="preserve"> </w:t>
@@ -2753,24 +2698,14 @@
       <w:r>
         <w:t xml:space="preserve"> Front: </w:t>
       </w:r>
-      <w:proofErr w:type="spellStart"/>
-      <w:r>
-        <w:t>DataGrid</w:t>
-      </w:r>
-      <w:proofErr w:type="spellEnd"/>
-      <w:r>
-        <w:t xml:space="preserve"> </w:t>
+      <w:r>
+        <w:t xml:space="preserve">DataGrid </w:t>
       </w:r>
       <w:r>
         <w:t xml:space="preserve">con </w:t>
       </w:r>
-      <w:proofErr w:type="spellStart"/>
-      <w:r>
-        <w:t>checkbox</w:t>
-      </w:r>
-      <w:proofErr w:type="spellEnd"/>
-      <w:r>
-        <w:t xml:space="preserve"> </w:t>
+      <w:r>
+        <w:t xml:space="preserve">checkbox </w:t>
       </w:r>
       <w:r>
         <w:t xml:space="preserve">para cada Nombre y Apellido </w:t>
@@ -2784,14 +2719,12 @@
       <w:r>
         <w:t xml:space="preserve">Selecciono un </w:t>
       </w:r>
-      <w:proofErr w:type="spellStart"/>
       <w:r>
         <w:rPr>
           <w:highlight w:val="yellow"/>
         </w:rPr>
         <w:t>IdUsuario</w:t>
       </w:r>
-      <w:proofErr w:type="spellEnd"/>
       <w:r>
         <w:t xml:space="preserve"> (Socio)</w:t>
       </w:r>
@@ -2834,19 +2767,9 @@
       <w:r>
         <w:t>/</w:t>
       </w:r>
-      <w:proofErr w:type="spellStart"/>
-      <w:r>
-        <w:t>Dia</w:t>
-      </w:r>
-      <w:proofErr w:type="spellEnd"/>
-      <w:r>
-        <w:t>/</w:t>
-      </w:r>
-      <w:proofErr w:type="spellStart"/>
-      <w:r>
-        <w:t>dias</w:t>
-      </w:r>
-      <w:proofErr w:type="spellEnd"/>
+      <w:r>
+        <w:t>Dia/dias</w:t>
+      </w:r>
       <w:r>
         <w:t xml:space="preserve"> </w:t>
       </w:r>
@@ -2856,21 +2779,8 @@
       <w:r>
         <w:t xml:space="preserve"> </w:t>
       </w:r>
-      <w:proofErr w:type="spellStart"/>
-      <w:r>
-        <w:t>IEnumerable</w:t>
-      </w:r>
-      <w:proofErr w:type="spellEnd"/>
-      <w:r>
-        <w:t>&lt;</w:t>
-      </w:r>
-      <w:proofErr w:type="spellStart"/>
-      <w:r>
-        <w:t>DiaDto</w:t>
-      </w:r>
-      <w:proofErr w:type="spellEnd"/>
-      <w:r>
-        <w:t>&gt;</w:t>
+      <w:r>
+        <w:t>IEnumerable&lt;DiaDto&gt;</w:t>
       </w:r>
       <w:r>
         <w:t xml:space="preserve"> </w:t>
@@ -2885,23 +2795,7 @@
         <w:t xml:space="preserve">: </w:t>
       </w:r>
       <w:r>
-        <w:t xml:space="preserve">Botones que representan cada </w:t>
-      </w:r>
-      <w:proofErr w:type="spellStart"/>
-      <w:r>
-        <w:t>NombreDia</w:t>
-      </w:r>
-      <w:proofErr w:type="spellEnd"/>
-      <w:r>
-        <w:t xml:space="preserve"> con su </w:t>
-      </w:r>
-      <w:proofErr w:type="spellStart"/>
-      <w:r>
-        <w:t>IdDia</w:t>
-      </w:r>
-      <w:proofErr w:type="spellEnd"/>
-      <w:r>
-        <w:t xml:space="preserve"> vinculado</w:t>
+        <w:t>Botones que representan cada NombreDia con su IdDia vinculado</w:t>
       </w:r>
       <w:r>
         <w:t xml:space="preserve"> </w:t>
@@ -2912,52 +2806,14 @@
       <w:r>
         <w:t xml:space="preserve"> Obtengo </w:t>
       </w:r>
-      <w:proofErr w:type="spellStart"/>
       <w:r>
         <w:rPr>
           <w:highlight w:val="green"/>
         </w:rPr>
-        <w:t>IdDia</w:t>
-      </w:r>
-      <w:proofErr w:type="spellEnd"/>
-      <w:r>
-        <w:rPr>
-          <w:highlight w:val="green"/>
-        </w:rPr>
-        <w:t xml:space="preserve"> para usarlo como </w:t>
-      </w:r>
-      <w:proofErr w:type="spellStart"/>
-      <w:r>
-        <w:rPr>
-          <w:highlight w:val="green"/>
-        </w:rPr>
-        <w:t>query</w:t>
-      </w:r>
-      <w:proofErr w:type="spellEnd"/>
-      <w:r>
-        <w:rPr>
-          <w:highlight w:val="green"/>
-        </w:rPr>
-        <w:t xml:space="preserve"> </w:t>
-      </w:r>
-      <w:proofErr w:type="spellStart"/>
-      <w:r>
-        <w:rPr>
-          <w:highlight w:val="green"/>
-        </w:rPr>
-        <w:t>param</w:t>
-      </w:r>
-      <w:proofErr w:type="spellEnd"/>
-      <w:r>
-        <w:t xml:space="preserve"> en el próximo </w:t>
-      </w:r>
-      <w:proofErr w:type="spellStart"/>
-      <w:r>
-        <w:t>endpoint</w:t>
-      </w:r>
-      <w:proofErr w:type="spellEnd"/>
-      <w:r>
-        <w:t>.</w:t>
+        <w:t>IdDia para usarlo como query param</w:t>
+      </w:r>
+      <w:r>
+        <w:t xml:space="preserve"> en el próximo endpoint.</w:t>
       </w:r>
     </w:p>
     <w:p>
@@ -2986,20 +2842,14 @@
       <w:r>
         <w:t>socios/{</w:t>
       </w:r>
-      <w:proofErr w:type="spellStart"/>
       <w:r>
         <w:rPr>
           <w:highlight w:val="yellow"/>
         </w:rPr>
         <w:t>idUsuarioSocio</w:t>
       </w:r>
-      <w:proofErr w:type="spellEnd"/>
-      <w:r>
-        <w:t>}/</w:t>
-      </w:r>
-      <w:proofErr w:type="spellStart"/>
-      <w:r>
-        <w:t>rutinas</w:t>
+      <w:r>
+        <w:t>}/rutinas</w:t>
       </w:r>
       <w:r>
         <w:rPr>
@@ -3007,16 +2857,7 @@
           <w:iCs/>
           <w:highlight w:val="green"/>
         </w:rPr>
-        <w:t>?idDia</w:t>
-      </w:r>
-      <w:proofErr w:type="spellEnd"/>
-      <w:r>
-        <w:rPr>
-          <w:i/>
-          <w:iCs/>
-          <w:highlight w:val="green"/>
-        </w:rPr>
-        <w:t>=1</w:t>
+        <w:t>?idDia=1</w:t>
       </w:r>
       <w:r>
         <w:t xml:space="preserve"> </w:t>
@@ -3025,15 +2866,7 @@
         <w:sym w:font="Wingdings" w:char="F0E0"/>
       </w:r>
       <w:r>
-        <w:t xml:space="preserve"> </w:t>
-      </w:r>
-      <w:proofErr w:type="spellStart"/>
-      <w:r>
-        <w:t>RutinaDto</w:t>
-      </w:r>
-      <w:proofErr w:type="spellEnd"/>
-      <w:r>
-        <w:t xml:space="preserve"> </w:t>
+        <w:t xml:space="preserve"> RutinaDto </w:t>
       </w:r>
       <w:r>
         <w:sym w:font="Wingdings" w:char="F0E0"/>
@@ -3062,7 +2895,6 @@
         </w:rPr>
         <w:t xml:space="preserve">Obtengo </w:t>
       </w:r>
-      <w:proofErr w:type="spellStart"/>
       <w:r>
         <w:rPr>
           <w:color w:val="000000" w:themeColor="text1"/>
@@ -3070,7 +2902,6 @@
         </w:rPr>
         <w:t>IdRutina</w:t>
       </w:r>
-      <w:proofErr w:type="spellEnd"/>
       <w:r>
         <w:rPr>
           <w:color w:val="000000" w:themeColor="text1"/>
@@ -3127,13 +2958,7 @@
         <w:rPr>
           <w:color w:val="000000" w:themeColor="text1"/>
         </w:rPr>
-        <w:t xml:space="preserve">al apretar el botón “+”, colocando una línea nueva al panel y luego apretando </w:t>
-      </w:r>
-      <w:r>
-        <w:rPr>
-          <w:color w:val="000000" w:themeColor="text1"/>
-        </w:rPr>
-        <w:t>el botón “Guardar”</w:t>
+        <w:t>al apretar el botón “+”, colocando una línea nueva al panel y luego apretando el botón “Guardar”</w:t>
       </w:r>
       <w:r>
         <w:rPr>
@@ -3214,13 +3039,7 @@
         <w:rPr>
           <w:color w:val="000000" w:themeColor="text1"/>
         </w:rPr>
-        <w:t xml:space="preserve">de Calentamiento/Entrenamiento/Estiramiento </w:t>
-      </w:r>
-      <w:r>
-        <w:rPr>
-          <w:color w:val="000000" w:themeColor="text1"/>
-        </w:rPr>
-        <w:t xml:space="preserve">al apretar el botón “Eliminar” </w:t>
+        <w:t xml:space="preserve">de Calentamiento/Entrenamiento/Estiramiento al apretar el botón “Eliminar” </w:t>
       </w:r>
       <w:r>
         <w:rPr>
@@ -3319,15 +3138,7 @@
         </w:numPr>
       </w:pPr>
       <w:r>
-        <w:t>GET api/</w:t>
-      </w:r>
-      <w:proofErr w:type="spellStart"/>
-      <w:r>
-        <w:t>GrupoMuscular</w:t>
-      </w:r>
-      <w:proofErr w:type="spellEnd"/>
-      <w:r>
-        <w:t xml:space="preserve"> </w:t>
+        <w:t xml:space="preserve">GET api/GrupoMuscular </w:t>
       </w:r>
       <w:r>
         <w:sym w:font="Wingdings" w:char="F0E0"/>
@@ -3335,21 +3146,8 @@
       <w:r>
         <w:t xml:space="preserve"> </w:t>
       </w:r>
-      <w:proofErr w:type="spellStart"/>
-      <w:r>
-        <w:t>IEnumerable</w:t>
-      </w:r>
-      <w:proofErr w:type="spellEnd"/>
-      <w:r>
-        <w:t>&lt;</w:t>
-      </w:r>
-      <w:proofErr w:type="spellStart"/>
-      <w:r>
-        <w:t>GrupoMuscularDto</w:t>
-      </w:r>
-      <w:proofErr w:type="spellEnd"/>
-      <w:r>
-        <w:t>&gt;</w:t>
+      <w:r>
+        <w:t>IEnumerable&lt;GrupoMuscularDto&gt;</w:t>
       </w:r>
       <w:r>
         <w:t xml:space="preserve"> </w:t>
@@ -3358,15 +3156,7 @@
         <w:sym w:font="Wingdings" w:char="F0E0"/>
       </w:r>
       <w:r>
-        <w:t xml:space="preserve"> Front: para el filtro se arma un mapa anatómico o </w:t>
-      </w:r>
-      <w:proofErr w:type="spellStart"/>
-      <w:r>
-        <w:t>dropdown</w:t>
-      </w:r>
-      <w:proofErr w:type="spellEnd"/>
-      <w:r>
-        <w:t xml:space="preserve"> </w:t>
+        <w:t xml:space="preserve"> Front: para el filtro se arma un mapa anatómico o dropdown </w:t>
       </w:r>
       <w:r>
         <w:sym w:font="Wingdings" w:char="F0E0"/>
@@ -3374,7 +3164,6 @@
       <w:r>
         <w:t xml:space="preserve"> Se obtiene </w:t>
       </w:r>
-      <w:proofErr w:type="spellStart"/>
       <w:r>
         <w:rPr>
           <w:highlight w:val="cyan"/>
@@ -3388,7 +3177,6 @@
         </w:rPr>
         <w:t>dGrupoMuscula</w:t>
       </w:r>
-      <w:proofErr w:type="spellEnd"/>
       <w:r>
         <w:rPr>
           <w:iCs/>
@@ -3405,38 +3193,15 @@
         </w:numPr>
       </w:pPr>
       <w:r>
-        <w:t>GET api/</w:t>
-      </w:r>
-      <w:proofErr w:type="spellStart"/>
-      <w:r>
-        <w:t>Ejercicio</w:t>
-      </w:r>
-      <w:proofErr w:type="gramStart"/>
+        <w:t>GET api/Ejercicio</w:t>
+      </w:r>
       <w:r>
         <w:rPr>
           <w:i/>
           <w:iCs/>
           <w:highlight w:val="cyan"/>
         </w:rPr>
-        <w:t>?</w:t>
-      </w:r>
-      <w:proofErr w:type="gramEnd"/>
-      <w:r>
-        <w:rPr>
-          <w:i/>
-          <w:iCs/>
-          <w:highlight w:val="cyan"/>
-        </w:rPr>
-        <w:t>idGrupoMuscular</w:t>
-      </w:r>
-      <w:proofErr w:type="spellEnd"/>
-      <w:r>
-        <w:rPr>
-          <w:i/>
-          <w:iCs/>
-          <w:highlight w:val="cyan"/>
-        </w:rPr>
-        <w:t>=1</w:t>
+        <w:t>?idGrupoMuscular=1</w:t>
       </w:r>
       <w:r>
         <w:t xml:space="preserve"> </w:t>
@@ -3447,21 +3212,8 @@
       <w:r>
         <w:t xml:space="preserve"> </w:t>
       </w:r>
-      <w:proofErr w:type="spellStart"/>
-      <w:r>
-        <w:t>IEnumerable</w:t>
-      </w:r>
-      <w:proofErr w:type="spellEnd"/>
-      <w:r>
-        <w:t>&lt;</w:t>
-      </w:r>
-      <w:proofErr w:type="spellStart"/>
-      <w:r>
-        <w:t>EjercicioDto</w:t>
-      </w:r>
-      <w:proofErr w:type="spellEnd"/>
-      <w:r>
-        <w:t>&gt;</w:t>
+      <w:r>
+        <w:t>IEnumerable&lt;EjercicioDto&gt;</w:t>
       </w:r>
       <w:r>
         <w:t xml:space="preserve"> </w:t>
@@ -3491,31 +3243,7 @@
         <w:sym w:font="Wingdings" w:char="F0E0"/>
       </w:r>
       <w:r>
-        <w:t xml:space="preserve"> Se obtiene </w:t>
-      </w:r>
-      <w:proofErr w:type="spellStart"/>
-      <w:r>
-        <w:t>IdEjercicio</w:t>
-      </w:r>
-      <w:proofErr w:type="spellEnd"/>
-      <w:r>
-        <w:t xml:space="preserve"> para colocar en el </w:t>
-      </w:r>
-      <w:proofErr w:type="spellStart"/>
-      <w:r>
-        <w:t>body</w:t>
-      </w:r>
-      <w:proofErr w:type="spellEnd"/>
-      <w:r>
-        <w:t xml:space="preserve"> del siguiente </w:t>
-      </w:r>
-      <w:proofErr w:type="spellStart"/>
-      <w:r>
-        <w:t>endpoint</w:t>
-      </w:r>
-      <w:proofErr w:type="spellEnd"/>
-      <w:r>
-        <w:t>.</w:t>
+        <w:t xml:space="preserve"> Se obtiene IdEjercicio para colocar en el body del siguiente endpoint.</w:t>
       </w:r>
     </w:p>
     <w:p>
@@ -3527,7 +3255,7 @@
         </w:numPr>
       </w:pPr>
       <w:r>
-        <w:t>GET</w:t>
+        <w:t>PUT</w:t>
       </w:r>
       <w:r>
         <w:t xml:space="preserve"> </w:t>
@@ -3539,24 +3267,17 @@
         <w:t>/</w:t>
       </w:r>
       <w:r>
-        <w:t>Rutina</w:t>
-      </w:r>
-      <w:proofErr w:type="gramStart"/>
-      <w:r>
-        <w:t>/</w:t>
+        <w:t>Rutina/</w:t>
       </w:r>
       <w:r>
         <w:t>{</w:t>
       </w:r>
-      <w:proofErr w:type="spellStart"/>
-      <w:proofErr w:type="gramEnd"/>
       <w:r>
         <w:rPr>
           <w:highlight w:val="magenta"/>
         </w:rPr>
         <w:t>idRutina</w:t>
       </w:r>
-      <w:proofErr w:type="spellEnd"/>
       <w:r>
         <w:t>}/bloques</w:t>
       </w:r>
@@ -3569,11 +3290,9 @@
       <w:r>
         <w:t xml:space="preserve"> </w:t>
       </w:r>
-      <w:proofErr w:type="spellStart"/>
       <w:r>
         <w:t>RutinaDto</w:t>
       </w:r>
-      <w:proofErr w:type="spellEnd"/>
       <w:r>
         <w:t xml:space="preserve"> </w:t>
       </w:r>
@@ -3585,6 +3304,18 @@
       </w:r>
       <w:r>
         <w:t>Calentamiento, Entrenamiento, Estiramiento</w:t>
+      </w:r>
+      <w:r>
+        <w:t xml:space="preserve"> </w:t>
+      </w:r>
+      <w:r>
+        <w:sym w:font="Wingdings" w:char="F0E0"/>
+      </w:r>
+      <w:r>
+        <w:t xml:space="preserve"> Policy: </w:t>
+      </w:r>
+      <w:r>
+        <w:t>EditarRutina</w:t>
       </w:r>
       <w:r>
         <w:t>.</w:t>
@@ -3620,15 +3351,8 @@
         </w:numPr>
       </w:pPr>
       <w:r>
-        <w:t>GET api/</w:t>
-      </w:r>
-      <w:proofErr w:type="spellStart"/>
-      <w:r>
-        <w:t>GrupoMuscular</w:t>
-      </w:r>
-      <w:proofErr w:type="spellEnd"/>
-      <w:r>
-        <w:t xml:space="preserve"> </w:t>
+        <w:lastRenderedPageBreak/>
+        <w:t xml:space="preserve">GET api/GrupoMuscular </w:t>
       </w:r>
       <w:r>
         <w:sym w:font="Wingdings" w:char="F0E0"/>
@@ -3636,21 +3360,8 @@
       <w:r>
         <w:t xml:space="preserve"> </w:t>
       </w:r>
-      <w:proofErr w:type="spellStart"/>
-      <w:r>
-        <w:t>IEnumerable</w:t>
-      </w:r>
-      <w:proofErr w:type="spellEnd"/>
-      <w:r>
-        <w:t>&lt;</w:t>
-      </w:r>
-      <w:proofErr w:type="spellStart"/>
-      <w:r>
-        <w:t>GrupoMuscularDto</w:t>
-      </w:r>
-      <w:proofErr w:type="spellEnd"/>
-      <w:r>
-        <w:t>&gt;</w:t>
+      <w:r>
+        <w:t>IEnumerable&lt;GrupoMuscularDto&gt;</w:t>
       </w:r>
       <w:r>
         <w:t xml:space="preserve"> </w:t>
@@ -3659,15 +3370,7 @@
         <w:sym w:font="Wingdings" w:char="F0E0"/>
       </w:r>
       <w:r>
-        <w:t xml:space="preserve"> Front: para el filtro se arma un mapa anatómico o </w:t>
-      </w:r>
-      <w:proofErr w:type="spellStart"/>
-      <w:r>
-        <w:t>dropdown</w:t>
-      </w:r>
-      <w:proofErr w:type="spellEnd"/>
-      <w:r>
-        <w:t xml:space="preserve"> </w:t>
+        <w:t xml:space="preserve"> Front: para el filtro se arma un mapa anatómico o dropdown </w:t>
       </w:r>
       <w:r>
         <w:sym w:font="Wingdings" w:char="F0E0"/>
@@ -3675,7 +3378,6 @@
       <w:r>
         <w:t xml:space="preserve"> Se obtiene </w:t>
       </w:r>
-      <w:proofErr w:type="spellStart"/>
       <w:r>
         <w:rPr>
           <w:highlight w:val="cyan"/>
@@ -3689,7 +3391,6 @@
         </w:rPr>
         <w:t>dGrupoMuscula</w:t>
       </w:r>
-      <w:proofErr w:type="spellEnd"/>
       <w:r>
         <w:rPr>
           <w:iCs/>
@@ -3706,39 +3407,15 @@
         </w:numPr>
       </w:pPr>
       <w:r>
-        <w:lastRenderedPageBreak/>
-        <w:t>GET api/</w:t>
-      </w:r>
-      <w:proofErr w:type="spellStart"/>
-      <w:r>
-        <w:t>Ejercicio</w:t>
-      </w:r>
-      <w:proofErr w:type="gramStart"/>
+        <w:t>GET api/Ejercicio</w:t>
+      </w:r>
       <w:r>
         <w:rPr>
           <w:i/>
           <w:iCs/>
           <w:highlight w:val="cyan"/>
         </w:rPr>
-        <w:t>?</w:t>
-      </w:r>
-      <w:proofErr w:type="gramEnd"/>
-      <w:r>
-        <w:rPr>
-          <w:i/>
-          <w:iCs/>
-          <w:highlight w:val="cyan"/>
-        </w:rPr>
-        <w:t>idGrupoMuscular</w:t>
-      </w:r>
-      <w:proofErr w:type="spellEnd"/>
-      <w:r>
-        <w:rPr>
-          <w:i/>
-          <w:iCs/>
-          <w:highlight w:val="cyan"/>
-        </w:rPr>
-        <w:t>=1</w:t>
+        <w:t>?idGrupoMuscular=1</w:t>
       </w:r>
       <w:r>
         <w:t xml:space="preserve"> </w:t>
@@ -3749,21 +3426,8 @@
       <w:r>
         <w:t xml:space="preserve"> </w:t>
       </w:r>
-      <w:proofErr w:type="spellStart"/>
-      <w:r>
-        <w:t>IEnumerable</w:t>
-      </w:r>
-      <w:proofErr w:type="spellEnd"/>
-      <w:r>
-        <w:t>&lt;</w:t>
-      </w:r>
-      <w:proofErr w:type="spellStart"/>
-      <w:r>
-        <w:t>EjercicioDto</w:t>
-      </w:r>
-      <w:proofErr w:type="spellEnd"/>
-      <w:r>
-        <w:t>&gt;</w:t>
+      <w:r>
+        <w:t>IEnumerable&lt;EjercicioDto&gt;</w:t>
       </w:r>
       <w:r>
         <w:t xml:space="preserve"> </w:t>
@@ -3798,29 +3462,8 @@
       <w:r>
         <w:t xml:space="preserve"> Se obtiene </w:t>
       </w:r>
-      <w:proofErr w:type="spellStart"/>
-      <w:r>
-        <w:t>IdEjercicio</w:t>
-      </w:r>
-      <w:proofErr w:type="spellEnd"/>
-      <w:r>
-        <w:t xml:space="preserve"> para colocar en el </w:t>
-      </w:r>
-      <w:proofErr w:type="spellStart"/>
-      <w:r>
-        <w:t>body</w:t>
-      </w:r>
-      <w:proofErr w:type="spellEnd"/>
-      <w:r>
-        <w:t xml:space="preserve"> del siguiente </w:t>
-      </w:r>
-      <w:proofErr w:type="spellStart"/>
-      <w:r>
-        <w:t>endpoint</w:t>
-      </w:r>
-      <w:proofErr w:type="spellEnd"/>
-      <w:r>
-        <w:t>.</w:t>
+      <w:r>
+        <w:t>IdEjercicio para colocar en el body del siguiente endpoint.</w:t>
       </w:r>
     </w:p>
     <w:p>
@@ -3832,7 +3475,7 @@
         </w:numPr>
       </w:pPr>
       <w:r>
-        <w:t>GET</w:t>
+        <w:t>PUT</w:t>
       </w:r>
       <w:r>
         <w:t xml:space="preserve"> </w:t>
@@ -3846,22 +3489,18 @@
       <w:r>
         <w:t>Rutina</w:t>
       </w:r>
-      <w:proofErr w:type="gramStart"/>
       <w:r>
         <w:t>/</w:t>
       </w:r>
       <w:r>
         <w:t>{</w:t>
       </w:r>
-      <w:proofErr w:type="spellStart"/>
-      <w:proofErr w:type="gramEnd"/>
       <w:r>
         <w:rPr>
           <w:highlight w:val="magenta"/>
         </w:rPr>
         <w:t>idRutina</w:t>
       </w:r>
-      <w:proofErr w:type="spellEnd"/>
       <w:r>
         <w:t>}/bloques</w:t>
       </w:r>
@@ -3874,11 +3513,9 @@
       <w:r>
         <w:t xml:space="preserve"> </w:t>
       </w:r>
-      <w:proofErr w:type="spellStart"/>
       <w:r>
         <w:t>RutinaDto</w:t>
       </w:r>
-      <w:proofErr w:type="spellEnd"/>
       <w:r>
         <w:t xml:space="preserve"> </w:t>
       </w:r>
@@ -3890,6 +3527,18 @@
       </w:r>
       <w:r>
         <w:t>Calentamiento, Entrenamiento, Estiramiento</w:t>
+      </w:r>
+      <w:r>
+        <w:t xml:space="preserve"> </w:t>
+      </w:r>
+      <w:r>
+        <w:sym w:font="Wingdings" w:char="F0E0"/>
+      </w:r>
+      <w:r>
+        <w:t xml:space="preserve"> Policy: </w:t>
+      </w:r>
+      <w:r>
+        <w:t>EditarRutina</w:t>
       </w:r>
       <w:r>
         <w:t>.</w:t>
@@ -3946,7 +3595,6 @@
       <w:r>
         <w:t>{</w:t>
       </w:r>
-      <w:proofErr w:type="spellStart"/>
       <w:r>
         <w:rPr>
           <w:color w:val="000000" w:themeColor="text1"/>
@@ -3954,7 +3602,6 @@
         </w:rPr>
         <w:t>idRutina</w:t>
       </w:r>
-      <w:proofErr w:type="spellEnd"/>
       <w:r>
         <w:t>}/historial</w:t>
       </w:r>
@@ -3967,40 +3614,44 @@
       <w:r>
         <w:t xml:space="preserve"> </w:t>
       </w:r>
-      <w:proofErr w:type="spellStart"/>
-      <w:r>
-        <w:t>DataGrid</w:t>
-      </w:r>
-      <w:proofErr w:type="spellEnd"/>
-      <w:r>
-        <w:t xml:space="preserve"> </w:t>
+      <w:r>
+        <w:t xml:space="preserve">DataGrid </w:t>
       </w:r>
       <w:r>
         <w:t xml:space="preserve">con </w:t>
       </w:r>
-      <w:proofErr w:type="spellStart"/>
+      <w:r>
+        <w:t xml:space="preserve">checkbox </w:t>
+      </w:r>
+      <w:r>
+        <w:t>IEnumerable&lt;RutinaHistorialResumenDto&gt;</w:t>
+      </w:r>
+      <w:r>
+        <w:t xml:space="preserve"> </w:t>
+      </w:r>
+      <w:r>
+        <w:sym w:font="Wingdings" w:char="F0E0"/>
+      </w:r>
+      <w:r>
+        <w:t xml:space="preserve"> Front:</w:t>
+      </w:r>
+      <w:r>
+        <w:t xml:space="preserve"> </w:t>
+      </w:r>
+      <w:r>
+        <w:t xml:space="preserve">DataGrid </w:t>
+      </w:r>
+      <w:r>
+        <w:t xml:space="preserve">con </w:t>
+      </w:r>
       <w:r>
         <w:t>checkbox</w:t>
       </w:r>
-      <w:proofErr w:type="spellEnd"/>
-      <w:r>
-        <w:t xml:space="preserve"> </w:t>
-      </w:r>
-      <w:proofErr w:type="spellStart"/>
-      <w:r>
-        <w:t>IEnumerable</w:t>
-      </w:r>
-      <w:proofErr w:type="spellEnd"/>
-      <w:r>
-        <w:t>&lt;</w:t>
-      </w:r>
-      <w:proofErr w:type="spellStart"/>
-      <w:r>
-        <w:t>RutinaHistorialResumenDto</w:t>
-      </w:r>
-      <w:proofErr w:type="spellEnd"/>
-      <w:r>
-        <w:t>&gt;</w:t>
+      <w:r>
+        <w:t xml:space="preserve"> </w:t>
+      </w:r>
+      <w:r>
+        <w:t>de versiones históricas guardadas automáticamente al modificar bloques</w:t>
       </w:r>
       <w:r>
         <w:t xml:space="preserve"> </w:t>
@@ -4009,50 +3660,14 @@
         <w:sym w:font="Wingdings" w:char="F0E0"/>
       </w:r>
       <w:r>
-        <w:t xml:space="preserve"> Front:</w:t>
-      </w:r>
-      <w:r>
-        <w:t xml:space="preserve"> </w:t>
-      </w:r>
-      <w:proofErr w:type="spellStart"/>
-      <w:r>
-        <w:t>DataGrid</w:t>
-      </w:r>
-      <w:proofErr w:type="spellEnd"/>
-      <w:r>
-        <w:t xml:space="preserve"> </w:t>
-      </w:r>
-      <w:r>
-        <w:t xml:space="preserve">con </w:t>
-      </w:r>
-      <w:proofErr w:type="spellStart"/>
-      <w:r>
-        <w:t>checkbox</w:t>
-      </w:r>
-      <w:proofErr w:type="spellEnd"/>
-      <w:r>
-        <w:t xml:space="preserve"> </w:t>
-      </w:r>
-      <w:r>
-        <w:t>de versiones históricas guardadas automáticamente al modificar bloques</w:t>
-      </w:r>
-      <w:r>
-        <w:t xml:space="preserve"> </w:t>
-      </w:r>
-      <w:r>
-        <w:sym w:font="Wingdings" w:char="F0E0"/>
-      </w:r>
-      <w:r>
         <w:t xml:space="preserve"> Obtengo </w:t>
       </w:r>
-      <w:proofErr w:type="spellStart"/>
       <w:r>
         <w:rPr>
           <w:highlight w:val="red"/>
         </w:rPr>
         <w:t>idRutinaHistorial</w:t>
       </w:r>
-      <w:proofErr w:type="spellEnd"/>
     </w:p>
     <w:p>
       <w:pPr>
@@ -4075,38 +3690,26 @@
         <w:t>/</w:t>
       </w:r>
       <w:r>
-        <w:t>Rutina</w:t>
-      </w:r>
-      <w:proofErr w:type="gramStart"/>
-      <w:r>
-        <w:t>/</w:t>
+        <w:t>Rutina/</w:t>
       </w:r>
       <w:r>
         <w:t>{</w:t>
       </w:r>
-      <w:proofErr w:type="spellStart"/>
-      <w:proofErr w:type="gramEnd"/>
       <w:r>
         <w:rPr>
           <w:highlight w:val="magenta"/>
         </w:rPr>
         <w:t>idRutina</w:t>
       </w:r>
-      <w:proofErr w:type="spellEnd"/>
-      <w:r>
-        <w:t>}/historial</w:t>
-      </w:r>
-      <w:r>
-        <w:t xml:space="preserve"> /{</w:t>
-      </w:r>
-      <w:proofErr w:type="spellStart"/>
+      <w:r>
+        <w:t>}/historial /{</w:t>
+      </w:r>
       <w:r>
         <w:rPr>
           <w:highlight w:val="red"/>
         </w:rPr>
         <w:t>idRutinaHistorial</w:t>
       </w:r>
-      <w:proofErr w:type="spellEnd"/>
       <w:r>
         <w:t>}</w:t>
       </w:r>
@@ -4119,11 +3722,9 @@
       <w:r>
         <w:t xml:space="preserve"> </w:t>
       </w:r>
-      <w:proofErr w:type="spellStart"/>
       <w:r>
         <w:t>RutinaHistorialDetalleDto</w:t>
       </w:r>
-      <w:proofErr w:type="spellEnd"/>
       <w:r>
         <w:t xml:space="preserve"> </w:t>
       </w:r>
@@ -4136,13 +3737,8 @@
       <w:r>
         <w:t xml:space="preserve"> </w:t>
       </w:r>
-      <w:proofErr w:type="spellStart"/>
-      <w:r>
-        <w:t>DataGrid</w:t>
-      </w:r>
-      <w:proofErr w:type="spellEnd"/>
-      <w:r>
-        <w:t xml:space="preserve"> </w:t>
+      <w:r>
+        <w:t xml:space="preserve">DataGrid </w:t>
       </w:r>
       <w:r>
         <w:t xml:space="preserve">con el </w:t>
@@ -4160,7 +3756,16 @@
         <w:t xml:space="preserve"> de Recuperación</w:t>
       </w:r>
       <w:r>
-        <w:t>.</w:t>
+        <w:t xml:space="preserve"> </w:t>
+      </w:r>
+      <w:r>
+        <w:sym w:font="Wingdings" w:char="F0E0"/>
+      </w:r>
+      <w:r>
+        <w:t xml:space="preserve"> Policy: </w:t>
+      </w:r>
+      <w:r>
+        <w:t>VerHistorialRutina</w:t>
       </w:r>
     </w:p>
     <w:p>
@@ -4184,39 +3789,24 @@
         <w:t>/</w:t>
       </w:r>
       <w:r>
-        <w:t>Rutina</w:t>
-      </w:r>
-      <w:proofErr w:type="gramStart"/>
+        <w:t>Rutina/</w:t>
+      </w:r>
+      <w:r>
+        <w:t>{</w:t>
+      </w:r>
+      <w:r>
+        <w:rPr>
+          <w:highlight w:val="magenta"/>
+        </w:rPr>
+        <w:t>idRutina</w:t>
+      </w:r>
+      <w:r>
+        <w:t>}/historial /{idRutinaHistorial}</w:t>
+      </w:r>
       <w:r>
         <w:t>/</w:t>
       </w:r>
       <w:r>
-        <w:t>{</w:t>
-      </w:r>
-      <w:proofErr w:type="spellStart"/>
-      <w:proofErr w:type="gramEnd"/>
-      <w:r>
-        <w:rPr>
-          <w:highlight w:val="magenta"/>
-        </w:rPr>
-        <w:t>idRutina</w:t>
-      </w:r>
-      <w:proofErr w:type="spellEnd"/>
-      <w:r>
-        <w:t>}/historial /{</w:t>
-      </w:r>
-      <w:proofErr w:type="spellStart"/>
-      <w:r>
-        <w:t>idRutinaHistorial</w:t>
-      </w:r>
-      <w:proofErr w:type="spellEnd"/>
-      <w:r>
-        <w:t>}</w:t>
-      </w:r>
-      <w:r>
-        <w:t>/</w:t>
-      </w:r>
-      <w:r>
         <w:t>restaurar</w:t>
       </w:r>
       <w:r>
@@ -4228,11 +3818,9 @@
       <w:r>
         <w:t xml:space="preserve"> </w:t>
       </w:r>
-      <w:proofErr w:type="spellStart"/>
       <w:r>
         <w:t>RutinaDto</w:t>
       </w:r>
-      <w:proofErr w:type="spellEnd"/>
       <w:r>
         <w:t xml:space="preserve"> </w:t>
       </w:r>
@@ -4252,7 +3840,19 @@
         <w:t>la</w:t>
       </w:r>
       <w:r>
-        <w:t xml:space="preserve"> versión histórica seleccionada.</w:t>
+        <w:t xml:space="preserve"> versión histórica seleccionada </w:t>
+      </w:r>
+      <w:r>
+        <w:sym w:font="Wingdings" w:char="F0E0"/>
+      </w:r>
+      <w:r>
+        <w:t xml:space="preserve"> Policy: </w:t>
+      </w:r>
+      <w:r>
+        <w:t>RecuperarRutina</w:t>
+      </w:r>
+      <w:r>
+        <w:t>.</w:t>
       </w:r>
     </w:p>
     <w:p>
@@ -4287,14 +3887,12 @@
       <w:r>
         <w:t xml:space="preserve"> {</w:t>
       </w:r>
-      <w:proofErr w:type="spellStart"/>
       <w:r>
         <w:rPr>
           <w:highlight w:val="magenta"/>
         </w:rPr>
         <w:t>idRutina</w:t>
       </w:r>
-      <w:proofErr w:type="spellEnd"/>
       <w:r>
         <w:t>}/estado</w:t>
       </w:r>
@@ -4307,11 +3905,9 @@
       <w:r>
         <w:t xml:space="preserve"> </w:t>
       </w:r>
-      <w:proofErr w:type="spellStart"/>
       <w:r>
         <w:t>RutinaDto</w:t>
       </w:r>
-      <w:proofErr w:type="spellEnd"/>
       <w:r>
         <w:t xml:space="preserve"> </w:t>
       </w:r>
@@ -4319,15 +3915,19 @@
         <w:sym w:font="Wingdings" w:char="F0E0"/>
       </w:r>
       <w:r>
-        <w:t xml:space="preserve"> Front: </w:t>
-      </w:r>
-      <w:proofErr w:type="spellStart"/>
-      <w:r>
-        <w:t>CheckBox</w:t>
-      </w:r>
-      <w:proofErr w:type="spellEnd"/>
-      <w:r>
-        <w:t xml:space="preserve"> para activar o desactivar la rutina actual consultada.</w:t>
+        <w:t xml:space="preserve"> Front: CheckBox para activar o desacti</w:t>
+      </w:r>
+      <w:r>
+        <w:t xml:space="preserve">var la rutina actual consultada </w:t>
+      </w:r>
+      <w:r>
+        <w:sym w:font="Wingdings" w:char="F0E0"/>
+      </w:r>
+      <w:r>
+        <w:t xml:space="preserve"> Policy: </w:t>
+      </w:r>
+      <w:r>
+        <w:t>EliminarRutina</w:t>
       </w:r>
     </w:p>
     <w:sectPr>
@@ -5331,6 +4931,7 @@
   <w:style w:type="character" w:default="1" w:styleId="Fuentedeprrafopredeter">
     <w:name w:val="Default Paragraph Font"/>
     <w:uiPriority w:val="1"/>
+    <w:semiHidden/>
     <w:unhideWhenUsed/>
   </w:style>
   <w:style w:type="table" w:default="1" w:styleId="Tablanormal">

</xml_diff>